<commit_message>
feat(cad): video Modul 9 versi klik GUI (pelat berlubang tarik)
- Rekaman klik GUI asli 11:21:
  - Part Design: Rectangle 180 x 60 (dimensi pertama menskalakan) -> Pad 5; lubang Ø15 di (90, 30) -> Pocket Through all (53.116,43 mm³)
  - FEM: Solid Material Steel-S235JR (E 210 GPa, nu 0,3); Fixed x = 0, Force 5000 N +X (normal muka)
  - Gmsh tet10 4 mm (5.843 elemen) + CalculiX; von Mises lewat Pipeline -> Field: 50,5 MPa di tepi lubang
  - konvergensi 2 / 1,5 mm: 52,81 / 54,35 MPa terhadap Kt*sigma_nom 53,83 MPa
  - Spreadsheet Ringkasan dengan rumus e = 0,97 % dan SF = 4,60
- Teks langkah 1-7 dan catatan Gambar 7 disesuaikan dengan video.

Co-Authored-By: Claude Opus 5.5 <noreply@anthropic.com>
</commit_message>
<xml_diff>
--- a/Pemodelan-Computer-Aided-Design/Modul-Word/Modul-9-Evaluasi-Hasil-Simulasi-dan-Analisis-Kekuatan.docx
+++ b/Pemodelan-Computer-Aided-Design/Modul-Word/Modul-9-Evaluasi-Hasil-Simulasi-dan-Analisis-Kekuatan.docx
@@ -13514,7 +13514,25 @@
           <w:i w:val="0"/>
           <w:sz w:val="22"/>
         </w:rPr>
-        <w:t>Part Design → Body → Sketch XY persegi panjang 60 × 180 (sudut di origin, fully constrained) → Pad 5. Sketch di muka atas: lingkaran ⌀15 berpusat (90, 30) → Pocket Through all.</w:t>
+        <w:t xml:space="preserve">File → New Document; Part Design → New Body; Sketch → New Sketch → XY-plane: </w:t>
+      </w:r>
+      <w:r>
+        <w:rPr>
+          <w:rFonts w:ascii="Arial" w:hAnsi="Arial" w:eastAsia="Arial" w:cs="Arial"/>
+          <w:b/>
+          <w:i w:val="0"/>
+          <w:sz w:val="22"/>
+        </w:rPr>
+        <w:t>Rectangle</w:t>
+      </w:r>
+      <w:r>
+        <w:rPr>
+          <w:rFonts w:ascii="Arial" w:hAnsi="Arial" w:eastAsia="Arial" w:cs="Arial"/>
+          <w:b w:val="0"/>
+          <w:i w:val="0"/>
+          <w:sz w:val="22"/>
+        </w:rPr>
+        <w:t xml:space="preserve"> dari titik asal → Horizontal Dimension 180 (seluruh persegi panjang ikut terskala), Vertical Dimension 60 → Fully constrained → Close → Pad 5. Klik muka atas → Sketch → New Sketch: lingkaran → Diameter 15, pusat Horizontal 90 dan Vertical 30 → Pocket Through all. Volume 53.116,43 mm³ = 180 · 60 · 5 − π · 7,5² · 5.</w:t>
       </w:r>
     </w:p>
     <w:p>
@@ -13547,7 +13565,44 @@
           <w:i w:val="0"/>
           <w:sz w:val="22"/>
         </w:rPr>
-        <w:t>FEM Workbench → Analysis container → Material solid: Steel (E = 210000 MPa, ν = 0.3). Periksa kartu material menampilkan satuan MPa, bukan Pa.</w:t>
+        <w:t xml:space="preserve">Workbench FEM → Model → New Analysis → Model → Materials → Solid Material: Standard → Metal → Steel → </w:t>
+      </w:r>
+      <w:r>
+        <w:rPr>
+          <w:rFonts w:ascii="Arial" w:hAnsi="Arial" w:eastAsia="Arial" w:cs="Arial"/>
+          <w:b/>
+          <w:i w:val="0"/>
+          <w:sz w:val="22"/>
+        </w:rPr>
+        <w:t>Steel-S235JR</w:t>
+      </w:r>
+      <w:r>
+        <w:rPr>
+          <w:rFonts w:ascii="Arial" w:hAnsi="Arial" w:eastAsia="Arial" w:cs="Arial"/>
+          <w:b w:val="0"/>
+          <w:i w:val="0"/>
+          <w:sz w:val="22"/>
+        </w:rPr>
+        <w:t xml:space="preserve"> (E = 210 GPa = 210000 MPa, ν = 0.3; baja S235 dengan σ</w:t>
+      </w:r>
+      <w:r>
+        <w:rPr>
+          <w:rFonts w:ascii="Arial" w:hAnsi="Arial" w:eastAsia="Arial" w:cs="Arial"/>
+          <w:b w:val="0"/>
+          <w:i w:val="0"/>
+          <w:sz w:val="22"/>
+          <w:vertAlign w:val="subscript"/>
+        </w:rPr>
+        <w:t>y</w:t>
+      </w:r>
+      <w:r>
+        <w:rPr>
+          <w:rFonts w:ascii="Arial" w:hAnsi="Arial" w:eastAsia="Arial" w:cs="Arial"/>
+          <w:b w:val="0"/>
+          <w:i w:val="0"/>
+          <w:sz w:val="22"/>
+        </w:rPr>
+        <w:t xml:space="preserve"> = 250 MPa) → OK. Panel menampilkan E dalam GPa: 210 GPa = 210000 MPa, bukan 210000 Pa.</w:t>
       </w:r>
     </w:p>
     <w:p>
@@ -13580,7 +13635,43 @@
           <w:i w:val="0"/>
           <w:sz w:val="22"/>
         </w:rPr>
-        <w:t>Constraint Fixed pada muka ujung x = 0; Constraint Force 5000 N arah +X pada muka ujung x = 180 (tarik). Arah gaya: pilih muka, Direction = normal muka, balik bila perlu.</w:t>
+        <w:t xml:space="preserve">Model → Mechanical Boundary Conditions and Loads → </w:t>
+      </w:r>
+      <w:r>
+        <w:rPr>
+          <w:rFonts w:ascii="Arial" w:hAnsi="Arial" w:eastAsia="Arial" w:cs="Arial"/>
+          <w:b/>
+          <w:i w:val="0"/>
+          <w:sz w:val="22"/>
+        </w:rPr>
+        <w:t>Fixed Boundary Condition</w:t>
+      </w:r>
+      <w:r>
+        <w:rPr>
+          <w:rFonts w:ascii="Arial" w:hAnsi="Arial" w:eastAsia="Arial" w:cs="Arial"/>
+          <w:b w:val="0"/>
+          <w:i w:val="0"/>
+          <w:sz w:val="22"/>
+        </w:rPr>
+        <w:t xml:space="preserve">: tekan 6 (Left), Add, klik muka ujung x = 0 → OK. </w:t>
+      </w:r>
+      <w:r>
+        <w:rPr>
+          <w:rFonts w:ascii="Arial" w:hAnsi="Arial" w:eastAsia="Arial" w:cs="Arial"/>
+          <w:b/>
+          <w:i w:val="0"/>
+          <w:sz w:val="22"/>
+        </w:rPr>
+        <w:t>Force Load</w:t>
+      </w:r>
+      <w:r>
+        <w:rPr>
+          <w:rFonts w:ascii="Arial" w:hAnsi="Arial" w:eastAsia="Arial" w:cs="Arial"/>
+          <w:b w:val="0"/>
+          <w:i w:val="0"/>
+          <w:sz w:val="22"/>
+        </w:rPr>
+        <w:t>: tekan 3 (Right), Add, klik muka ujung x = 180, Force 5000 N → OK. Tanpa Direction, gaya mengikuti normal muka (+X, keluar): pelat tertarik.</w:t>
       </w:r>
     </w:p>
     <w:p>
@@ -13613,7 +13704,25 @@
           <w:i w:val="0"/>
           <w:sz w:val="22"/>
         </w:rPr>
-        <w:t>FEM mesh from shape by Gmsh: Element order 2, Max size 4 mm → Apply. Catat jumlah elemen. Solver CalculiX Standard → Write input → Run.</w:t>
+        <w:t xml:space="preserve">Pilih Body → Mesh → </w:t>
+      </w:r>
+      <w:r>
+        <w:rPr>
+          <w:rFonts w:ascii="Arial" w:hAnsi="Arial" w:eastAsia="Arial" w:cs="Arial"/>
+          <w:b/>
+          <w:i w:val="0"/>
+          <w:sz w:val="22"/>
+        </w:rPr>
+        <w:t>Mesh From Shape by Gmsh</w:t>
+      </w:r>
+      <w:r>
+        <w:rPr>
+          <w:rFonts w:ascii="Arial" w:hAnsi="Arial" w:eastAsia="Arial" w:cs="Arial"/>
+          <w:b w:val="0"/>
+          <w:i w:val="0"/>
+          <w:sz w:val="22"/>
+        </w:rPr>
+        <w:t>: Element order 2nd, Maximum size 4 mm → Apply → OK: 11.972 simpul, 5.843 elemen. Solve → Solver CalculiX; klik ganda SolverCcxTools → Static → Write .inp File → Run CalculiX → Close.</w:t>
       </w:r>
     </w:p>
     <w:p>
@@ -13646,7 +13755,25 @@
           <w:i w:val="0"/>
           <w:sz w:val="22"/>
         </w:rPr>
-        <w:t>Klik dua kali CCX_Results → von Mises: catat maksimum dan lokasinya (tepi lubang, sisi atas/bawah). Bandingkan dengan K</w:t>
+        <w:t xml:space="preserve">Sembunyikan Body dan mesh; Pipeline_CCX_Results → View → Field = </w:t>
+      </w:r>
+      <w:r>
+        <w:rPr>
+          <w:rFonts w:ascii="Arial" w:hAnsi="Arial" w:eastAsia="Arial" w:cs="Arial"/>
+          <w:b w:val="0"/>
+          <w:i/>
+          <w:sz w:val="22"/>
+        </w:rPr>
+        <w:t>von Mises Stress</w:t>
+      </w:r>
+      <w:r>
+        <w:rPr>
+          <w:rFonts w:ascii="Arial" w:hAnsi="Arial" w:eastAsia="Arial" w:cs="Arial"/>
+          <w:b w:val="0"/>
+          <w:i w:val="0"/>
+          <w:sz w:val="22"/>
+        </w:rPr>
+        <w:t>: tegangan tertinggi (merah) di tepi lubang, sisi atas dan bawah. Python console: round(max(App.ActiveDocument.CCX_Results.vonMises), 2) → 50,5 MPa; Displacement maks 0,015 mm. Bandingkan dengan K</w:t>
       </w:r>
       <w:r>
         <w:rPr>
@@ -13684,7 +13811,7 @@
           <w:i w:val="0"/>
           <w:sz w:val="22"/>
         </w:rPr>
-        <w:t xml:space="preserve"> = 53,83 MPa; hitung e. Baca juga Displacement maks.</w:t>
+        <w:t xml:space="preserve"> = 53,83 MPa; hitung e.</w:t>
       </w:r>
     </w:p>
     <w:p>
@@ -13717,7 +13844,7 @@
           <w:i w:val="0"/>
           <w:sz w:val="22"/>
         </w:rPr>
-        <w:t>Tambahkan FEM MeshRegion 1 mm pada muka silinder lubang (atau Max size 2 mm global), mesh ulang, solve ulang. Perubahan σ</w:t>
+        <w:t>Klik ganda FEMMeshGmsh → Maximum size 2 → Apply → OK, jalankan solver lagi: 34.615 elemen, σ</w:t>
       </w:r>
       <w:r>
         <w:rPr>
@@ -13736,7 +13863,7 @@
           <w:i w:val="0"/>
           <w:sz w:val="22"/>
         </w:rPr>
-        <w:t xml:space="preserve"> harus &lt; 5 %; bila belum, haluskan sekali lagi. Isi tabel analitis vs FEM.</w:t>
+        <w:t xml:space="preserve"> = 52,81 MPa (+4,6 %); 1,5 mm: 84.696 elemen, 54,35 MPa (+2,9 %): perubahan makin kecil dan &lt; 5 %. Cara yang lebih hemat elemen: FEM MeshRegion 1 mm hanya pada muka silinder lubang.</w:t>
       </w:r>
     </w:p>
     <w:p>
@@ -13769,45 +13896,25 @@
           <w:i w:val="0"/>
           <w:sz w:val="22"/>
         </w:rPr>
-        <w:t>SF = 250/σ</w:t>
-      </w:r>
-      <w:r>
-        <w:rPr>
-          <w:rFonts w:ascii="Arial" w:hAnsi="Arial" w:eastAsia="Arial" w:cs="Arial"/>
-          <w:b w:val="0"/>
-          <w:i w:val="0"/>
-          <w:sz w:val="22"/>
-          <w:vertAlign w:val="subscript"/>
-        </w:rPr>
-        <w:t>vm,maks</w:t>
-      </w:r>
-      <w:r>
-        <w:rPr>
-          <w:rFonts w:ascii="Arial" w:hAnsi="Arial" w:eastAsia="Arial" w:cs="Arial"/>
-          <w:b w:val="0"/>
-          <w:i w:val="0"/>
-          <w:sz w:val="22"/>
-        </w:rPr>
-        <w:t>; tuliskan σ</w:t>
-      </w:r>
-      <w:r>
-        <w:rPr>
-          <w:rFonts w:ascii="Arial" w:hAnsi="Arial" w:eastAsia="Arial" w:cs="Arial"/>
-          <w:b w:val="0"/>
-          <w:i w:val="0"/>
-          <w:sz w:val="22"/>
-          <w:vertAlign w:val="subscript"/>
-        </w:rPr>
-        <w:t>maks</w:t>
-      </w:r>
-      <w:r>
-        <w:rPr>
-          <w:rFonts w:ascii="Arial" w:hAnsi="Arial" w:eastAsia="Arial" w:cs="Arial"/>
-          <w:b w:val="0"/>
-          <w:i w:val="0"/>
-          <w:sz w:val="22"/>
-        </w:rPr>
-        <w:t xml:space="preserve"> analitis, FEM, e, SF pada Spreadsheet di dokumen. Ctrl+S → Latihan9_NIM.FCStd (hasil ikut tersimpan bila objek hasil tidak dihapus).</w:t>
+        <w:t xml:space="preserve">Workbench Spreadsheet → Spreadsheet → </w:t>
+      </w:r>
+      <w:r>
+        <w:rPr>
+          <w:rFonts w:ascii="Arial" w:hAnsi="Arial" w:eastAsia="Arial" w:cs="Arial"/>
+          <w:b/>
+          <w:i w:val="0"/>
+          <w:sz w:val="22"/>
+        </w:rPr>
+        <w:t>New Spreadsheet</w:t>
+      </w:r>
+      <w:r>
+        <w:rPr>
+          <w:rFonts w:ascii="Arial" w:hAnsi="Arial" w:eastAsia="Arial" w:cs="Arial"/>
+          <w:b w:val="0"/>
+          <w:i w:val="0"/>
+          <w:sz w:val="22"/>
+        </w:rPr>
+        <w:t>, F2 ganti nama “Ringkasan”, klik ganda. Kolom A: sigma analitis, sigma FEM, e (%), SF; kolom B: 53.83, 54.35, =(B2 - B1) / B1 * 100 → 0,97 %, =250 / B2 → SF = 4,60. Kembali ke tab 3D, Ctrl+S → Latihan9_NIM.FCStd (hasil ikut tersimpan bila objek hasil tidak dihapus).</w:t>
       </w:r>
     </w:p>
     <w:p>

</xml_diff>

<commit_message>
feat(cad): video Modul 9 versi klik GUI (pelat berlubang tarik) (#1044)
- Rekaman klik GUI asli 11:21:
  - Part Design: Rectangle 180 x 60 (dimensi pertama menskalakan) -> Pad 5; lubang Ø15 di (90, 30) -> Pocket Through all (53.116,43 mm³)
  - FEM: Solid Material Steel-S235JR (E 210 GPa, nu 0,3); Fixed x = 0, Force 5000 N +X (normal muka)
  - Gmsh tet10 4 mm (5.843 elemen) + CalculiX; von Mises lewat Pipeline -> Field: 50,5 MPa di tepi lubang
  - konvergensi 2 / 1,5 mm: 52,81 / 54,35 MPa terhadap Kt*sigma_nom 53,83 MPa
  - Spreadsheet Ringkasan dengan rumus e = 0,97 % dan SF = 4,60
- Teks langkah 1-7 dan catatan Gambar 7 disesuaikan dengan video.

Co-authored-by: Claude Opus 5.5 <noreply@anthropic.com>
</commit_message>
<xml_diff>
--- a/Pemodelan-Computer-Aided-Design/Modul-Word/Modul-9-Evaluasi-Hasil-Simulasi-dan-Analisis-Kekuatan.docx
+++ b/Pemodelan-Computer-Aided-Design/Modul-Word/Modul-9-Evaluasi-Hasil-Simulasi-dan-Analisis-Kekuatan.docx
@@ -13514,7 +13514,25 @@
           <w:i w:val="0"/>
           <w:sz w:val="22"/>
         </w:rPr>
-        <w:t>Part Design → Body → Sketch XY persegi panjang 60 × 180 (sudut di origin, fully constrained) → Pad 5. Sketch di muka atas: lingkaran ⌀15 berpusat (90, 30) → Pocket Through all.</w:t>
+        <w:t xml:space="preserve">File → New Document; Part Design → New Body; Sketch → New Sketch → XY-plane: </w:t>
+      </w:r>
+      <w:r>
+        <w:rPr>
+          <w:rFonts w:ascii="Arial" w:hAnsi="Arial" w:eastAsia="Arial" w:cs="Arial"/>
+          <w:b/>
+          <w:i w:val="0"/>
+          <w:sz w:val="22"/>
+        </w:rPr>
+        <w:t>Rectangle</w:t>
+      </w:r>
+      <w:r>
+        <w:rPr>
+          <w:rFonts w:ascii="Arial" w:hAnsi="Arial" w:eastAsia="Arial" w:cs="Arial"/>
+          <w:b w:val="0"/>
+          <w:i w:val="0"/>
+          <w:sz w:val="22"/>
+        </w:rPr>
+        <w:t xml:space="preserve"> dari titik asal → Horizontal Dimension 180 (seluruh persegi panjang ikut terskala), Vertical Dimension 60 → Fully constrained → Close → Pad 5. Klik muka atas → Sketch → New Sketch: lingkaran → Diameter 15, pusat Horizontal 90 dan Vertical 30 → Pocket Through all. Volume 53.116,43 mm³ = 180 · 60 · 5 − π · 7,5² · 5.</w:t>
       </w:r>
     </w:p>
     <w:p>
@@ -13547,7 +13565,44 @@
           <w:i w:val="0"/>
           <w:sz w:val="22"/>
         </w:rPr>
-        <w:t>FEM Workbench → Analysis container → Material solid: Steel (E = 210000 MPa, ν = 0.3). Periksa kartu material menampilkan satuan MPa, bukan Pa.</w:t>
+        <w:t xml:space="preserve">Workbench FEM → Model → New Analysis → Model → Materials → Solid Material: Standard → Metal → Steel → </w:t>
+      </w:r>
+      <w:r>
+        <w:rPr>
+          <w:rFonts w:ascii="Arial" w:hAnsi="Arial" w:eastAsia="Arial" w:cs="Arial"/>
+          <w:b/>
+          <w:i w:val="0"/>
+          <w:sz w:val="22"/>
+        </w:rPr>
+        <w:t>Steel-S235JR</w:t>
+      </w:r>
+      <w:r>
+        <w:rPr>
+          <w:rFonts w:ascii="Arial" w:hAnsi="Arial" w:eastAsia="Arial" w:cs="Arial"/>
+          <w:b w:val="0"/>
+          <w:i w:val="0"/>
+          <w:sz w:val="22"/>
+        </w:rPr>
+        <w:t xml:space="preserve"> (E = 210 GPa = 210000 MPa, ν = 0.3; baja S235 dengan σ</w:t>
+      </w:r>
+      <w:r>
+        <w:rPr>
+          <w:rFonts w:ascii="Arial" w:hAnsi="Arial" w:eastAsia="Arial" w:cs="Arial"/>
+          <w:b w:val="0"/>
+          <w:i w:val="0"/>
+          <w:sz w:val="22"/>
+          <w:vertAlign w:val="subscript"/>
+        </w:rPr>
+        <w:t>y</w:t>
+      </w:r>
+      <w:r>
+        <w:rPr>
+          <w:rFonts w:ascii="Arial" w:hAnsi="Arial" w:eastAsia="Arial" w:cs="Arial"/>
+          <w:b w:val="0"/>
+          <w:i w:val="0"/>
+          <w:sz w:val="22"/>
+        </w:rPr>
+        <w:t xml:space="preserve"> = 250 MPa) → OK. Panel menampilkan E dalam GPa: 210 GPa = 210000 MPa, bukan 210000 Pa.</w:t>
       </w:r>
     </w:p>
     <w:p>
@@ -13580,7 +13635,43 @@
           <w:i w:val="0"/>
           <w:sz w:val="22"/>
         </w:rPr>
-        <w:t>Constraint Fixed pada muka ujung x = 0; Constraint Force 5000 N arah +X pada muka ujung x = 180 (tarik). Arah gaya: pilih muka, Direction = normal muka, balik bila perlu.</w:t>
+        <w:t xml:space="preserve">Model → Mechanical Boundary Conditions and Loads → </w:t>
+      </w:r>
+      <w:r>
+        <w:rPr>
+          <w:rFonts w:ascii="Arial" w:hAnsi="Arial" w:eastAsia="Arial" w:cs="Arial"/>
+          <w:b/>
+          <w:i w:val="0"/>
+          <w:sz w:val="22"/>
+        </w:rPr>
+        <w:t>Fixed Boundary Condition</w:t>
+      </w:r>
+      <w:r>
+        <w:rPr>
+          <w:rFonts w:ascii="Arial" w:hAnsi="Arial" w:eastAsia="Arial" w:cs="Arial"/>
+          <w:b w:val="0"/>
+          <w:i w:val="0"/>
+          <w:sz w:val="22"/>
+        </w:rPr>
+        <w:t xml:space="preserve">: tekan 6 (Left), Add, klik muka ujung x = 0 → OK. </w:t>
+      </w:r>
+      <w:r>
+        <w:rPr>
+          <w:rFonts w:ascii="Arial" w:hAnsi="Arial" w:eastAsia="Arial" w:cs="Arial"/>
+          <w:b/>
+          <w:i w:val="0"/>
+          <w:sz w:val="22"/>
+        </w:rPr>
+        <w:t>Force Load</w:t>
+      </w:r>
+      <w:r>
+        <w:rPr>
+          <w:rFonts w:ascii="Arial" w:hAnsi="Arial" w:eastAsia="Arial" w:cs="Arial"/>
+          <w:b w:val="0"/>
+          <w:i w:val="0"/>
+          <w:sz w:val="22"/>
+        </w:rPr>
+        <w:t>: tekan 3 (Right), Add, klik muka ujung x = 180, Force 5000 N → OK. Tanpa Direction, gaya mengikuti normal muka (+X, keluar): pelat tertarik.</w:t>
       </w:r>
     </w:p>
     <w:p>
@@ -13613,7 +13704,25 @@
           <w:i w:val="0"/>
           <w:sz w:val="22"/>
         </w:rPr>
-        <w:t>FEM mesh from shape by Gmsh: Element order 2, Max size 4 mm → Apply. Catat jumlah elemen. Solver CalculiX Standard → Write input → Run.</w:t>
+        <w:t xml:space="preserve">Pilih Body → Mesh → </w:t>
+      </w:r>
+      <w:r>
+        <w:rPr>
+          <w:rFonts w:ascii="Arial" w:hAnsi="Arial" w:eastAsia="Arial" w:cs="Arial"/>
+          <w:b/>
+          <w:i w:val="0"/>
+          <w:sz w:val="22"/>
+        </w:rPr>
+        <w:t>Mesh From Shape by Gmsh</w:t>
+      </w:r>
+      <w:r>
+        <w:rPr>
+          <w:rFonts w:ascii="Arial" w:hAnsi="Arial" w:eastAsia="Arial" w:cs="Arial"/>
+          <w:b w:val="0"/>
+          <w:i w:val="0"/>
+          <w:sz w:val="22"/>
+        </w:rPr>
+        <w:t>: Element order 2nd, Maximum size 4 mm → Apply → OK: 11.972 simpul, 5.843 elemen. Solve → Solver CalculiX; klik ganda SolverCcxTools → Static → Write .inp File → Run CalculiX → Close.</w:t>
       </w:r>
     </w:p>
     <w:p>
@@ -13646,7 +13755,25 @@
           <w:i w:val="0"/>
           <w:sz w:val="22"/>
         </w:rPr>
-        <w:t>Klik dua kali CCX_Results → von Mises: catat maksimum dan lokasinya (tepi lubang, sisi atas/bawah). Bandingkan dengan K</w:t>
+        <w:t xml:space="preserve">Sembunyikan Body dan mesh; Pipeline_CCX_Results → View → Field = </w:t>
+      </w:r>
+      <w:r>
+        <w:rPr>
+          <w:rFonts w:ascii="Arial" w:hAnsi="Arial" w:eastAsia="Arial" w:cs="Arial"/>
+          <w:b w:val="0"/>
+          <w:i/>
+          <w:sz w:val="22"/>
+        </w:rPr>
+        <w:t>von Mises Stress</w:t>
+      </w:r>
+      <w:r>
+        <w:rPr>
+          <w:rFonts w:ascii="Arial" w:hAnsi="Arial" w:eastAsia="Arial" w:cs="Arial"/>
+          <w:b w:val="0"/>
+          <w:i w:val="0"/>
+          <w:sz w:val="22"/>
+        </w:rPr>
+        <w:t>: tegangan tertinggi (merah) di tepi lubang, sisi atas dan bawah. Python console: round(max(App.ActiveDocument.CCX_Results.vonMises), 2) → 50,5 MPa; Displacement maks 0,015 mm. Bandingkan dengan K</w:t>
       </w:r>
       <w:r>
         <w:rPr>
@@ -13684,7 +13811,7 @@
           <w:i w:val="0"/>
           <w:sz w:val="22"/>
         </w:rPr>
-        <w:t xml:space="preserve"> = 53,83 MPa; hitung e. Baca juga Displacement maks.</w:t>
+        <w:t xml:space="preserve"> = 53,83 MPa; hitung e.</w:t>
       </w:r>
     </w:p>
     <w:p>
@@ -13717,7 +13844,7 @@
           <w:i w:val="0"/>
           <w:sz w:val="22"/>
         </w:rPr>
-        <w:t>Tambahkan FEM MeshRegion 1 mm pada muka silinder lubang (atau Max size 2 mm global), mesh ulang, solve ulang. Perubahan σ</w:t>
+        <w:t>Klik ganda FEMMeshGmsh → Maximum size 2 → Apply → OK, jalankan solver lagi: 34.615 elemen, σ</w:t>
       </w:r>
       <w:r>
         <w:rPr>
@@ -13736,7 +13863,7 @@
           <w:i w:val="0"/>
           <w:sz w:val="22"/>
         </w:rPr>
-        <w:t xml:space="preserve"> harus &lt; 5 %; bila belum, haluskan sekali lagi. Isi tabel analitis vs FEM.</w:t>
+        <w:t xml:space="preserve"> = 52,81 MPa (+4,6 %); 1,5 mm: 84.696 elemen, 54,35 MPa (+2,9 %): perubahan makin kecil dan &lt; 5 %. Cara yang lebih hemat elemen: FEM MeshRegion 1 mm hanya pada muka silinder lubang.</w:t>
       </w:r>
     </w:p>
     <w:p>
@@ -13769,45 +13896,25 @@
           <w:i w:val="0"/>
           <w:sz w:val="22"/>
         </w:rPr>
-        <w:t>SF = 250/σ</w:t>
-      </w:r>
-      <w:r>
-        <w:rPr>
-          <w:rFonts w:ascii="Arial" w:hAnsi="Arial" w:eastAsia="Arial" w:cs="Arial"/>
-          <w:b w:val="0"/>
-          <w:i w:val="0"/>
-          <w:sz w:val="22"/>
-          <w:vertAlign w:val="subscript"/>
-        </w:rPr>
-        <w:t>vm,maks</w:t>
-      </w:r>
-      <w:r>
-        <w:rPr>
-          <w:rFonts w:ascii="Arial" w:hAnsi="Arial" w:eastAsia="Arial" w:cs="Arial"/>
-          <w:b w:val="0"/>
-          <w:i w:val="0"/>
-          <w:sz w:val="22"/>
-        </w:rPr>
-        <w:t>; tuliskan σ</w:t>
-      </w:r>
-      <w:r>
-        <w:rPr>
-          <w:rFonts w:ascii="Arial" w:hAnsi="Arial" w:eastAsia="Arial" w:cs="Arial"/>
-          <w:b w:val="0"/>
-          <w:i w:val="0"/>
-          <w:sz w:val="22"/>
-          <w:vertAlign w:val="subscript"/>
-        </w:rPr>
-        <w:t>maks</w:t>
-      </w:r>
-      <w:r>
-        <w:rPr>
-          <w:rFonts w:ascii="Arial" w:hAnsi="Arial" w:eastAsia="Arial" w:cs="Arial"/>
-          <w:b w:val="0"/>
-          <w:i w:val="0"/>
-          <w:sz w:val="22"/>
-        </w:rPr>
-        <w:t xml:space="preserve"> analitis, FEM, e, SF pada Spreadsheet di dokumen. Ctrl+S → Latihan9_NIM.FCStd (hasil ikut tersimpan bila objek hasil tidak dihapus).</w:t>
+        <w:t xml:space="preserve">Workbench Spreadsheet → Spreadsheet → </w:t>
+      </w:r>
+      <w:r>
+        <w:rPr>
+          <w:rFonts w:ascii="Arial" w:hAnsi="Arial" w:eastAsia="Arial" w:cs="Arial"/>
+          <w:b/>
+          <w:i w:val="0"/>
+          <w:sz w:val="22"/>
+        </w:rPr>
+        <w:t>New Spreadsheet</w:t>
+      </w:r>
+      <w:r>
+        <w:rPr>
+          <w:rFonts w:ascii="Arial" w:hAnsi="Arial" w:eastAsia="Arial" w:cs="Arial"/>
+          <w:b w:val="0"/>
+          <w:i w:val="0"/>
+          <w:sz w:val="22"/>
+        </w:rPr>
+        <w:t>, F2 ganti nama “Ringkasan”, klik ganda. Kolom A: sigma analitis, sigma FEM, e (%), SF; kolom B: 53.83, 54.35, =(B2 - B1) / B1 * 100 → 0,97 %, =250 / B2 → SF = 4,60. Kembali ke tab 3D, Ctrl+S → Latihan9_NIM.FCStd (hasil ikut tersimpan bila objek hasil tidak dihapus).</w:t>
       </w:r>
     </w:p>
     <w:p>

</xml_diff>